<commit_message>
Actualizar domicilio de Medusssa.Studio a Xalapa en ambos contratos
Domicilio del prestador en Xalapa-Enríquez, Veracruz; establecimiento
del cliente en la zona conurbada Veracruz-Boca del Río; viáticos de
traslado Xalapa-Boca del Río a cargo del cliente; jurisdicción en
Xalapa.

Co-Authored-By: Claude Fable 5 <noreply@anthropic.com>
Claude-Session: https://claude.ai/code/session_01KpH8oR29wiBhy4iSar9w76
</commit_message>
<xml_diff>
--- a/extravagance/Contrato_Medusssa_Extravagance_Paquete_10000.docx
+++ b/extravagance/Contrato_Medusssa_Extravagance_Paquete_10000.docx
@@ -279,7 +279,7 @@
           <w:sz w:val="21"/>
           <w:szCs w:val="21"/>
         </w:rPr>
-        <w:t xml:space="preserve">Que para efectos de este contrato señala como domicilio el ubicado en [DOMICILIO DE MEDUSSSA.STUDIO], en Boca del Río, Veracruz, México, y como correo electrónico de contacto [CORREO DE MEDUSSSA.STUDIO].</w:t>
+        <w:t xml:space="preserve">Que tiene su domicilio y centro de operaciones en la ciudad de Xalapa-Enríquez, Veracruz, México, señalando para efectos de este contrato el domicilio ubicado en [DOMICILIO DE MEDUSSSA.STUDIO EN XALAPA] y como correo electrónico de contacto [CORREO DE MEDUSSSA.STUDIO].</w:t>
       </w:r>
     </w:p>
     <w:p>
@@ -298,6 +298,25 @@
           <w:sz w:val="21"/>
           <w:szCs w:val="21"/>
         </w:rPr>
+        <w:t xml:space="preserve">Que, para la ejecución de los servicios que así lo requieran (producciones de foto y video y visitas al establecimiento), se trasladará desde la ciudad de Xalapa, Veracruz, a la zona conurbada Veracruz–Boca del Río, donde se ubica el establecimiento de EL CLIENTE.</w:t>
+      </w:r>
+    </w:p>
+    <w:p>
+      <w:pPr>
+        <w:pStyle w:val="ListParagraph"/>
+        <w:numPr>
+          <w:ilvl w:val="0"/>
+          <w:numId w:val="2"/>
+        </w:numPr>
+        <w:spacing w:after="120" w:line="276"/>
+        <w:jc w:val="both"/>
+      </w:pPr>
+      <w:r>
+        <w:rPr>
+          <w:rFonts w:ascii="Calibri" w:cs="Calibri" w:eastAsia="Calibri" w:hAnsi="Calibri"/>
+          <w:sz w:val="21"/>
+          <w:szCs w:val="21"/>
+        </w:rPr>
         <w:t xml:space="preserve">Que su Registro Federal de Contribuyentes es [RFC DEL PRESTADOR] y que se encuentra al corriente en el cumplimiento de sus obligaciones fiscales.</w:t>
       </w:r>
     </w:p>
@@ -333,7 +352,7 @@
           <w:sz w:val="21"/>
           <w:szCs w:val="21"/>
         </w:rPr>
-        <w:t xml:space="preserve">Que es una persona física o moral legalmente constituida conforme a las leyes de los Estados Unidos Mexicanos, que opera el establecimiento mercantil conocido comercialmente como “EXTRAVAGANCE” (centro de entretenimiento para adultos), ubicado en [DOMICILIO DEL ESTABLECIMIENTO].</w:t>
+        <w:t xml:space="preserve">Que es una persona física o moral legalmente constituida conforme a las leyes de los Estados Unidos Mexicanos, que opera el establecimiento mercantil conocido comercialmente como “EXTRAVAGANCE” (centro de entretenimiento para adultos), ubicado en [DOMICILIO DEL ESTABLECIMIENTO], en la zona conurbada Veracruz–Boca del Río, Veracruz.</w:t>
       </w:r>
     </w:p>
     <w:p>
@@ -790,7 +809,7 @@
           <w:sz w:val="21"/>
           <w:szCs w:val="21"/>
         </w:rPr>
-        <w:t xml:space="preserve">Viáticos, traslados fuera de la zona conurbada Veracruz–Boca del Río, y gastos extraordinarios aprobados previamente por EL CLIENTE.</w:t>
+        <w:t xml:space="preserve">Los viáticos y gastos de traslado de EL PRESTADOR desde la ciudad de Xalapa, Veracruz, a la zona conurbada Veracruz–Boca del Río con motivo de las producciones y visitas al establecimiento (transporte, y en su caso alimentos y hospedaje cuando la jornada lo requiera), los cuales serán cubiertos por EL CLIENTE contra comprobante o conforme a la tarifa que LAS PARTES acuerden por escrito, así como cualquier gasto extraordinario aprobado previamente por EL CLIENTE.</w:t>
       </w:r>
     </w:p>
     <w:p>
@@ -1772,7 +1791,7 @@
           <w:sz w:val="21"/>
           <w:szCs w:val="21"/>
         </w:rPr>
-        <w:t xml:space="preserve">Para la interpretación y cumplimiento de este contrato, LAS PARTES se someten a la legislación mexicana y a la jurisdicción de los tribunales competentes de la ciudad de Boca del Río, Veracruz, renunciando expresamente a cualquier otro fuero que pudiera corresponderles por razón de sus domicilios presentes o futuros.</w:t>
+        <w:t xml:space="preserve">Para la interpretación y cumplimiento de este contrato, LAS PARTES se someten a la legislación mexicana y a la jurisdicción de los tribunales competentes de la ciudad de Xalapa-Enríquez, Veracruz, renunciando expresamente a cualquier otro fuero que pudiera corresponderles por razón de sus domicilios presentes o futuros.</w:t>
       </w:r>
     </w:p>
     <w:p>
@@ -1786,7 +1805,7 @@
           <w:sz w:val="21"/>
           <w:szCs w:val="21"/>
         </w:rPr>
-        <w:t xml:space="preserve">Leído que fue el presente contrato y enteradas LAS PARTES de su contenido y alcance legal, lo firman por duplicado en la ciudad de Boca del Río, Veracruz, el día [DÍA] de [MES] de [AÑO].</w:t>
+        <w:t xml:space="preserve">Leído que fue el presente contrato y enteradas LAS PARTES de su contenido y alcance legal, lo firman por duplicado en la ciudad de [CIUDAD DE FIRMA], Veracruz, el día [DÍA] de [MES] de [AÑO].</w:t>
       </w:r>
     </w:p>
     <w:tbl>

</xml_diff>